<commit_message>
Finishing touches on UTH for May
</commit_message>
<xml_diff>
--- a/Posts/2026/05(May)/UndertheHood/UTH_05(May)_CRTBP5_equlibrium_points.docx
+++ b/Posts/2026/05(May)/UndertheHood/UTH_05(May)_CRTBP5_equlibrium_points.docx
@@ -4,7 +4,13 @@
   <w:body>
     <w:p>
       <w:r>
-        <w:t xml:space="preserve">In the two posts, we established the general structure of the pseudopotential and the fact that the allowed motions are restricted to certain spatial regions depending on the value of the Jacobi constant $C_J$.  In addition, we qualitatively </w:t>
+        <w:t xml:space="preserve">In the </w:t>
+      </w:r>
+      <w:r>
+        <w:t xml:space="preserve">last </w:t>
+      </w:r>
+      <w:r>
+        <w:t xml:space="preserve">two posts, we established the general structure of the pseudopotential and the fact that the allowed motions are restricted to certain spatial regions depending on the value of the Jacobi constant $C_J$.  In addition, we qualitatively </w:t>
       </w:r>
       <w:r>
         <w:t xml:space="preserve">argued </w:t>
@@ -202,7 +208,7 @@
     </w:p>
     <w:p>
       <w:r>
-        <w:t>There are two choices: the quantity within the braces ‘$[\cdots] = 0$ or $y=0$.  Let’s examine th</w:t>
+        <w:t>There are two choices: the quantity within the braces $[\cdots] = 0$ or $y=0$.  Let’s examine th</w:t>
       </w:r>
       <w:r>
         <w:t>em in order.</w:t>
@@ -210,6 +216,7 @@
     </w:p>
     <w:p>
       <w:r>
+        <w:lastRenderedPageBreak/>
         <w:t xml:space="preserve">Next, let’s factor the </w:t>
       </w:r>
       <w:r>
@@ -853,10 +860,7 @@
         <w:t xml:space="preserve"> of $</w:t>
       </w:r>
       <w:r>
-        <w:t>d</w:t>
-      </w:r>
-      <w:r>
-        <w:t>_2$</w:t>
+        <w:t>d_2$</w:t>
       </w:r>
       <w:r>
         <w:t xml:space="preserve"> give</w:t>
@@ -1297,13 +1301,13 @@
         <w:t>me fro</w:t>
       </w:r>
       <w:r>
-        <w:t>m ass</w:t>
-      </w:r>
-      <w:r>
-        <w:t>uming $</w:t>
-      </w:r>
-      <w:r>
-        <w:t>y=</w:t>
+        <w:t xml:space="preserve">m </w:t>
+      </w:r>
+      <w:r>
+        <w:t>going back to the choice we had to make after requiring $z=0$ and this time requiring $y</w:t>
+      </w:r>
+      <w:r>
+        <w:t>=</w:t>
       </w:r>
       <w:r>
         <w:t>0</w:t>
@@ -1312,32 +1316,333 @@
         <w:t>$</w:t>
       </w:r>
       <w:r>
-        <w:t xml:space="preserve">.  </w:t>
-      </w:r>
-    </w:p>
-    <w:p>
-      <w:r>
-        <w:t>If we set the quantity in the braces ($[\cdots]$) to zero, we can then substitute that ithen factor the</w:t>
-      </w:r>
-    </w:p>
-    <w:p>
-      <w:r>
-        <w:t>(subject to the equilibrium conditions) to get</w:t>
-      </w:r>
-      <w:r>
-        <w:t xml:space="preserve"> condition </w:t>
-      </w:r>
-    </w:p>
-    <w:p>
-      <w:r>
-        <w:t xml:space="preserve">\[ </w:t>
+        <w:t xml:space="preserve"> as well</w:t>
+      </w:r>
+      <w:r>
+        <w:t>.</w:t>
+      </w:r>
+      <w:r>
+        <w:t xml:space="preserve">  All we now have to work with is the </w:t>
+      </w:r>
+      <w:r>
+        <w:t xml:space="preserve">master </w:t>
+      </w:r>
+      <w:r>
+        <w:t>$x$-equation that reads</w:t>
       </w:r>
     </w:p>
     <w:p/>
-    <w:p/>
-    <w:p>
-      <w:r>
-        <w:t xml:space="preserve"> </w:t>
+    <w:p>
+      <w:r>
+        <w:t>\[ x - \frac{(1-\mu)</w:t>
+      </w:r>
+      <w:r>
+        <w:t>(</w:t>
+      </w:r>
+      <w:r>
+        <w:t>x+\mu</w:t>
+      </w:r>
+      <w:r>
+        <w:t>)</w:t>
+      </w:r>
+      <w:r>
+        <w:t>}{|x+\mu|^3} + \frac{\mu(1-\mu-x)}{|x+\mu-1|^3} \; ,\]</w:t>
+      </w:r>
+    </w:p>
+    <w:p>
+      <w:r>
+        <w:lastRenderedPageBreak/>
+        <w:t xml:space="preserve">where $d_1$ simplifies to $|x+\mu|$ and $d_2$ to $|x+\mu-1|$.  </w:t>
+      </w:r>
+      <w:r>
+        <w:t xml:space="preserve"> The master equation is actually three-fold b</w:t>
+      </w:r>
+      <w:r>
+        <w:t>ased on the value of $x$</w:t>
+      </w:r>
+      <w:r>
+        <w:t xml:space="preserve">; </w:t>
+      </w:r>
+      <w:r>
+        <w:t>we get three different</w:t>
+      </w:r>
+      <w:r>
+        <w:t xml:space="preserve">, specific </w:t>
+      </w:r>
+      <w:r>
+        <w:t xml:space="preserve">equations </w:t>
+      </w:r>
+      <w:r>
+        <w:t xml:space="preserve">for the three different regions </w:t>
+      </w:r>
+      <w:r>
+        <w:t>shown in the figure below</w:t>
+      </w:r>
+    </w:p>
+    <w:p>
+      <w:pPr>
+        <w:jc w:val="center"/>
+      </w:pPr>
+      <w:r>
+        <w:rPr>
+          <w:noProof/>
+        </w:rPr>
+        <w:drawing>
+          <wp:inline distT="0" distB="0" distL="0" distR="0" wp14:anchorId="5EB68C70" wp14:editId="11707435">
+            <wp:extent cx="5320181" cy="1497442"/>
+            <wp:effectExtent l="0" t="0" r="0" b="0"/>
+            <wp:docPr id="1925689601" name="Picture 1"/>
+            <wp:cNvGraphicFramePr>
+              <a:graphicFrameLocks xmlns:a="http://schemas.openxmlformats.org/drawingml/2006/main" noChangeAspect="1"/>
+            </wp:cNvGraphicFramePr>
+            <a:graphic xmlns:a="http://schemas.openxmlformats.org/drawingml/2006/main">
+              <a:graphicData uri="http://schemas.openxmlformats.org/drawingml/2006/picture">
+                <pic:pic xmlns:pic="http://schemas.openxmlformats.org/drawingml/2006/picture">
+                  <pic:nvPicPr>
+                    <pic:cNvPr id="0" name="Picture 2"/>
+                    <pic:cNvPicPr>
+                      <a:picLocks noChangeAspect="1" noChangeArrowheads="1"/>
+                    </pic:cNvPicPr>
+                  </pic:nvPicPr>
+                  <pic:blipFill>
+                    <a:blip r:embed="rId5" cstate="print">
+                      <a:extLst>
+                        <a:ext uri="{28A0092B-C50C-407E-A947-70E740481C1C}">
+                          <a14:useLocalDpi xmlns:a14="http://schemas.microsoft.com/office/drawing/2010/main" val="0"/>
+                        </a:ext>
+                      </a:extLst>
+                    </a:blip>
+                    <a:srcRect/>
+                    <a:stretch>
+                      <a:fillRect/>
+                    </a:stretch>
+                  </pic:blipFill>
+                  <pic:spPr bwMode="auto">
+                    <a:xfrm>
+                      <a:off x="0" y="0"/>
+                      <a:ext cx="5355755" cy="1507455"/>
+                    </a:xfrm>
+                    <a:prstGeom prst="rect">
+                      <a:avLst/>
+                    </a:prstGeom>
+                    <a:noFill/>
+                  </pic:spPr>
+                </pic:pic>
+              </a:graphicData>
+            </a:graphic>
+          </wp:inline>
+        </w:drawing>
+      </w:r>
+    </w:p>
+    <w:p>
+      <w:r>
+        <w:t>and defined by:</w:t>
+      </w:r>
+    </w:p>
+    <w:p>
+      <w:pPr>
+        <w:pStyle w:val="ListParagraph"/>
+        <w:numPr>
+          <w:ilvl w:val="0"/>
+          <w:numId w:val="1"/>
+        </w:numPr>
+      </w:pPr>
+      <w:r>
+        <w:t>Region I: $ -\mu \le</w:t>
+      </w:r>
+      <w:r>
+        <w:t>q</w:t>
+      </w:r>
+      <w:r>
+        <w:t xml:space="preserve"> x \le</w:t>
+      </w:r>
+      <w:r>
+        <w:t>q</w:t>
+      </w:r>
+      <w:r>
+        <w:t xml:space="preserve"> 1 - \mu$</w:t>
+      </w:r>
+    </w:p>
+    <w:p>
+      <w:pPr>
+        <w:pStyle w:val="ListParagraph"/>
+        <w:numPr>
+          <w:ilvl w:val="0"/>
+          <w:numId w:val="1"/>
+        </w:numPr>
+      </w:pPr>
+      <w:r>
+        <w:t>Region II: $x \gt 1-\mu$</w:t>
+      </w:r>
+    </w:p>
+    <w:p>
+      <w:pPr>
+        <w:pStyle w:val="ListParagraph"/>
+        <w:numPr>
+          <w:ilvl w:val="0"/>
+          <w:numId w:val="1"/>
+        </w:numPr>
+      </w:pPr>
+      <w:r>
+        <w:t>Region III:  $x &lt; -\mu$</w:t>
+      </w:r>
+    </w:p>
+    <w:p>
+      <w:r>
+        <w:t xml:space="preserve">In each region, the resulting equation is a fifth-order or quintic equation with no exact solution and only one real root.  There is no universal agreement about the numbering/labeling of these regions but the convention I am following is the single most common one being followed today by most (if not all) space agencies.  Since JWST flies in Region II, we will focus on the solution in that region.  The other two regions follow in similar manner. </w:t>
+      </w:r>
+    </w:p>
+    <w:p>
+      <w:r>
+        <w:t>In Region II, $x &gt; 1 - \mu$ and so $|x+\mu| &gt; 0$ and $|x-1+\mu| &gt;0$</w:t>
+      </w:r>
+      <w:r>
+        <w:t>.  It is convenient to define $\gamma \equiv x -1+\mu$, which is the distance from the secondary to the Region II equilibrium point (hereafter labeled L</w:t>
+      </w:r>
+      <w:r>
+        <w:rPr>
+          <w:vertAlign w:val="subscript"/>
+        </w:rPr>
+        <w:t>2</w:t>
+      </w:r>
+      <w:r>
+        <w:t>).  In terms of $\gamma$, the master equation in Region II becomes:</w:t>
+      </w:r>
+    </w:p>
+    <w:p>
+      <w:r>
+        <w:t>\[ \gamma + 1 - \mu \frac{1-\mu}{(\gamma+1)^2} - \frac{\mu}{\gamma^2} = 0 \; .\]</w:t>
+      </w:r>
+    </w:p>
+    <w:p>
+      <w:r>
+        <w:t>The next step, which is purely for notational convenience, is to define $\beta = 1-\mu$.  Next multiply the equation by $\gamma^2$ and $(\gamma+1)^2$ to arrive at</w:t>
+      </w:r>
+    </w:p>
+    <w:p>
+      <w:r>
+        <w:t>\[ \gamma (\gamma + 1)^2 \gamma^2 + \beta (\gamma+1)^2 \gamma^2 - \beta \gamma^2 - \mu (\gamma+1)^2 \; .\]</w:t>
+      </w:r>
+    </w:p>
+    <w:p>
+      <w:r>
+        <w:t>The algebra is manageable if we then add and subtract $2\beta \gamma + \beta$ allowing us to complete a square and then factor out $(\gamma + 1)^2$ from most of the terms.  These steps leave us at</w:t>
+      </w:r>
+    </w:p>
+    <w:p>
+      <w:r>
+        <w:lastRenderedPageBreak/>
+        <w:t>\[ (\gamma^3 + \beta \gamma^2 - \beta - \mu)(\gamma + 1)^2 + \beta(2\gamma + 1) = 0 \; . \]</w:t>
+      </w:r>
+    </w:p>
+    <w:p>
+      <w:r>
+        <w:t>In the final step, expand and collect terms and then back-substitute to eliminate $\beta$ to get</w:t>
+      </w:r>
+    </w:p>
+    <w:p>
+      <w:r>
+        <w:t>\[ \gamma^5 + (3-\mu) \gamma^4 + (3-2\mu)\gamma^3 - \mu \gamma^2 -2\mu \gamma  -\mu = 0 \; .\]</w:t>
+      </w:r>
+    </w:p>
+    <w:p>
+      <w:hyperlink r:id="rId6" w:history="1">
+        <w:r>
+          <w:rPr>
+            <w:rStyle w:val="Hyperlink"/>
+          </w:rPr>
+          <w:t>Descartes’ rule of signs dictates</w:t>
+        </w:r>
+      </w:hyperlink>
+      <w:r>
+        <w:t xml:space="preserve"> that there is only one real root because all the coefficients above $\gamma^2$ are positive (recall $\mu \leq 1/2$) and all the remaining coefficients are negative.  For the Sun-Earth/Moon barycenter, $\mu \approx 3.04\times 10^{-6}$.  A plot of the polynomial above is </w:t>
+      </w:r>
+    </w:p>
+    <w:p>
+      <w:r>
+        <w:rPr>
+          <w:noProof/>
+        </w:rPr>
+        <w:drawing>
+          <wp:inline distT="0" distB="0" distL="0" distR="0" wp14:anchorId="2C02C262" wp14:editId="4AF3A36C">
+            <wp:extent cx="5943600" cy="2971800"/>
+            <wp:effectExtent l="0" t="0" r="0" b="0"/>
+            <wp:docPr id="2075946755" name="Picture 2"/>
+            <wp:cNvGraphicFramePr>
+              <a:graphicFrameLocks xmlns:a="http://schemas.openxmlformats.org/drawingml/2006/main" noChangeAspect="1"/>
+            </wp:cNvGraphicFramePr>
+            <a:graphic xmlns:a="http://schemas.openxmlformats.org/drawingml/2006/main">
+              <a:graphicData uri="http://schemas.openxmlformats.org/drawingml/2006/picture">
+                <pic:pic xmlns:pic="http://schemas.openxmlformats.org/drawingml/2006/picture">
+                  <pic:nvPicPr>
+                    <pic:cNvPr id="0" name="Picture 2"/>
+                    <pic:cNvPicPr>
+                      <a:picLocks noChangeAspect="1" noChangeArrowheads="1"/>
+                    </pic:cNvPicPr>
+                  </pic:nvPicPr>
+                  <pic:blipFill>
+                    <a:blip r:embed="rId7">
+                      <a:extLst>
+                        <a:ext uri="{28A0092B-C50C-407E-A947-70E740481C1C}">
+                          <a14:useLocalDpi xmlns:a14="http://schemas.microsoft.com/office/drawing/2010/main" val="0"/>
+                        </a:ext>
+                      </a:extLst>
+                    </a:blip>
+                    <a:srcRect/>
+                    <a:stretch>
+                      <a:fillRect/>
+                    </a:stretch>
+                  </pic:blipFill>
+                  <pic:spPr bwMode="auto">
+                    <a:xfrm>
+                      <a:off x="0" y="0"/>
+                      <a:ext cx="5943600" cy="2971800"/>
+                    </a:xfrm>
+                    <a:prstGeom prst="rect">
+                      <a:avLst/>
+                    </a:prstGeom>
+                    <a:noFill/>
+                    <a:ln>
+                      <a:noFill/>
+                    </a:ln>
+                  </pic:spPr>
+                </pic:pic>
+              </a:graphicData>
+            </a:graphic>
+          </wp:inline>
+        </w:drawing>
+      </w:r>
+    </w:p>
+    <w:p>
+      <w:r>
+        <w:t>and the approximate value of the root is $</w:t>
+      </w:r>
+      <w:r>
+        <w:t>\gamma</w:t>
+      </w:r>
+      <w:r>
+        <w:t xml:space="preserve">_{L_2} = </w:t>
+      </w:r>
+      <w:r>
+        <w:t>0.01</w:t>
+      </w:r>
+      <w:r>
+        <w:t xml:space="preserve">$.  Multiplying by 1AU </w:t>
+      </w:r>
+      <w:r>
+        <w:t>yields that the L2 point is approximately 1.5 million kilometers from Earth, which is the well-known value.</w:t>
+      </w:r>
+    </w:p>
+    <w:p>
+      <w:r>
+        <w:t xml:space="preserve">A final note:  There are no instances of circular motion to be found in the solar system, so the actual motion, while close to the CRTBP, is really the elliptic restricted problem.  Because of that, it is common in most pieces of software to solve the quintic equation at each time step based on the instantaneous distance between the massives.  This leads to a ‘moving equilibrium’ point which may seem to be a contradiction but which, in practice, is fine as the motion of massives about their barycenter is small in its eccentricity.  The number of studies of the general elliptic, restricted three body problem is far more limited </w:t>
+      </w:r>
+      <w:r>
+        <w:lastRenderedPageBreak/>
+        <w:t xml:space="preserve">due to the fact that is has little practical application.  Nonetheless, the idea is </w:t>
+      </w:r>
+      <w:r>
+        <w:t>dynamically interesting and may be explored in a future blog if space (and interest) permit.</w:t>
       </w:r>
     </w:p>
     <w:sectPr>
@@ -1348,6 +1653,127 @@
     </w:sectPr>
   </w:body>
 </w:document>
+</file>
+
+<file path=word/numbering.xml><?xml version="1.0" encoding="utf-8"?>
+<w:numbering xmlns:wpc="http://schemas.microsoft.com/office/word/2010/wordprocessingCanvas" xmlns:cx="http://schemas.microsoft.com/office/drawing/2014/chartex" xmlns:cx1="http://schemas.microsoft.com/office/drawing/2015/9/8/chartex" xmlns:cx2="http://schemas.microsoft.com/office/drawing/2015/10/21/chartex" xmlns:cx3="http://schemas.microsoft.com/office/drawing/2016/5/9/chartex" xmlns:cx4="http://schemas.microsoft.com/office/drawing/2016/5/10/chartex" xmlns:cx5="http://schemas.microsoft.com/office/drawing/2016/5/11/chartex" xmlns:cx6="http://schemas.microsoft.com/office/drawing/2016/5/12/chartex" xmlns:cx7="http://schemas.microsoft.com/office/drawing/2016/5/13/chartex" xmlns:cx8="http://schemas.microsoft.com/office/drawing/2016/5/14/chartex" xmlns:mc="http://schemas.openxmlformats.org/markup-compatibility/2006" xmlns:aink="http://schemas.microsoft.com/office/drawing/2016/ink" xmlns:am3d="http://schemas.microsoft.com/office/drawing/2017/model3d" xmlns:o="urn:schemas-microsoft-com:office:office" xmlns:oel="http://schemas.microsoft.com/office/2019/extlst" xmlns:r="http://schemas.openxmlformats.org/officeDocument/2006/relationships" xmlns:m="http://schemas.openxmlformats.org/officeDocument/2006/math" xmlns:v="urn:schemas-microsoft-com:vml" xmlns:wp14="http://schemas.microsoft.com/office/word/2010/wordprocessingDrawing" xmlns:wp="http://schemas.openxmlformats.org/drawingml/2006/wordprocessingDrawing" xmlns:w10="urn:schemas-microsoft-com:office:word" xmlns:w="http://schemas.openxmlformats.org/wordprocessingml/2006/main" xmlns:w14="http://schemas.microsoft.com/office/word/2010/wordml" xmlns:w15="http://schemas.microsoft.com/office/word/2012/wordml" xmlns:w16cex="http://schemas.microsoft.com/office/word/2018/wordml/cex" xmlns:w16cid="http://schemas.microsoft.com/office/word/2016/wordml/cid" xmlns:w16="http://schemas.microsoft.com/office/word/2018/wordml" xmlns:w16du="http://schemas.microsoft.com/office/word/2023/wordml/word16du" xmlns:w16sdtdh="http://schemas.microsoft.com/office/word/2020/wordml/sdtdatahash" xmlns:w16sdtfl="http://schemas.microsoft.com/office/word/2024/wordml/sdtformatlock" xmlns:w16se="http://schemas.microsoft.com/office/word/2015/wordml/symex" xmlns:wpg="http://schemas.microsoft.com/office/word/2010/wordprocessingGroup" xmlns:wpi="http://schemas.microsoft.com/office/word/2010/wordprocessingInk" xmlns:wne="http://schemas.microsoft.com/office/word/2006/wordml" xmlns:wps="http://schemas.microsoft.com/office/word/2010/wordprocessingShape" mc:Ignorable="w14 w15 w16se w16cid w16 w16cex w16sdtdh w16sdtfl w16du wp14">
+  <w:abstractNum w:abstractNumId="0" w15:restartNumberingAfterBreak="0">
+    <w:nsid w:val="3A494A5B"/>
+    <w:multiLevelType w:val="hybridMultilevel"/>
+    <w:tmpl w:val="7124D648"/>
+    <w:lvl w:ilvl="0" w:tplc="04090001">
+      <w:start w:val="1"/>
+      <w:numFmt w:val="bullet"/>
+      <w:lvlText w:val=""/>
+      <w:lvlJc w:val="left"/>
+      <w:pPr>
+        <w:ind w:left="720" w:hanging="360"/>
+      </w:pPr>
+      <w:rPr>
+        <w:rFonts w:ascii="Symbol" w:hAnsi="Symbol" w:hint="default"/>
+      </w:rPr>
+    </w:lvl>
+    <w:lvl w:ilvl="1" w:tplc="04090003" w:tentative="1">
+      <w:start w:val="1"/>
+      <w:numFmt w:val="bullet"/>
+      <w:lvlText w:val="o"/>
+      <w:lvlJc w:val="left"/>
+      <w:pPr>
+        <w:ind w:left="1440" w:hanging="360"/>
+      </w:pPr>
+      <w:rPr>
+        <w:rFonts w:ascii="Courier New" w:hAnsi="Courier New" w:cs="Courier New" w:hint="default"/>
+      </w:rPr>
+    </w:lvl>
+    <w:lvl w:ilvl="2" w:tplc="04090005" w:tentative="1">
+      <w:start w:val="1"/>
+      <w:numFmt w:val="bullet"/>
+      <w:lvlText w:val=""/>
+      <w:lvlJc w:val="left"/>
+      <w:pPr>
+        <w:ind w:left="2160" w:hanging="360"/>
+      </w:pPr>
+      <w:rPr>
+        <w:rFonts w:ascii="Wingdings" w:hAnsi="Wingdings" w:hint="default"/>
+      </w:rPr>
+    </w:lvl>
+    <w:lvl w:ilvl="3" w:tplc="04090001" w:tentative="1">
+      <w:start w:val="1"/>
+      <w:numFmt w:val="bullet"/>
+      <w:lvlText w:val=""/>
+      <w:lvlJc w:val="left"/>
+      <w:pPr>
+        <w:ind w:left="2880" w:hanging="360"/>
+      </w:pPr>
+      <w:rPr>
+        <w:rFonts w:ascii="Symbol" w:hAnsi="Symbol" w:hint="default"/>
+      </w:rPr>
+    </w:lvl>
+    <w:lvl w:ilvl="4" w:tplc="04090003" w:tentative="1">
+      <w:start w:val="1"/>
+      <w:numFmt w:val="bullet"/>
+      <w:lvlText w:val="o"/>
+      <w:lvlJc w:val="left"/>
+      <w:pPr>
+        <w:ind w:left="3600" w:hanging="360"/>
+      </w:pPr>
+      <w:rPr>
+        <w:rFonts w:ascii="Courier New" w:hAnsi="Courier New" w:cs="Courier New" w:hint="default"/>
+      </w:rPr>
+    </w:lvl>
+    <w:lvl w:ilvl="5" w:tplc="04090005" w:tentative="1">
+      <w:start w:val="1"/>
+      <w:numFmt w:val="bullet"/>
+      <w:lvlText w:val=""/>
+      <w:lvlJc w:val="left"/>
+      <w:pPr>
+        <w:ind w:left="4320" w:hanging="360"/>
+      </w:pPr>
+      <w:rPr>
+        <w:rFonts w:ascii="Wingdings" w:hAnsi="Wingdings" w:hint="default"/>
+      </w:rPr>
+    </w:lvl>
+    <w:lvl w:ilvl="6" w:tplc="04090001" w:tentative="1">
+      <w:start w:val="1"/>
+      <w:numFmt w:val="bullet"/>
+      <w:lvlText w:val=""/>
+      <w:lvlJc w:val="left"/>
+      <w:pPr>
+        <w:ind w:left="5040" w:hanging="360"/>
+      </w:pPr>
+      <w:rPr>
+        <w:rFonts w:ascii="Symbol" w:hAnsi="Symbol" w:hint="default"/>
+      </w:rPr>
+    </w:lvl>
+    <w:lvl w:ilvl="7" w:tplc="04090003" w:tentative="1">
+      <w:start w:val="1"/>
+      <w:numFmt w:val="bullet"/>
+      <w:lvlText w:val="o"/>
+      <w:lvlJc w:val="left"/>
+      <w:pPr>
+        <w:ind w:left="5760" w:hanging="360"/>
+      </w:pPr>
+      <w:rPr>
+        <w:rFonts w:ascii="Courier New" w:hAnsi="Courier New" w:cs="Courier New" w:hint="default"/>
+      </w:rPr>
+    </w:lvl>
+    <w:lvl w:ilvl="8" w:tplc="04090005" w:tentative="1">
+      <w:start w:val="1"/>
+      <w:numFmt w:val="bullet"/>
+      <w:lvlText w:val=""/>
+      <w:lvlJc w:val="left"/>
+      <w:pPr>
+        <w:ind w:left="6480" w:hanging="360"/>
+      </w:pPr>
+      <w:rPr>
+        <w:rFonts w:ascii="Wingdings" w:hAnsi="Wingdings" w:hint="default"/>
+      </w:rPr>
+    </w:lvl>
+  </w:abstractNum>
+  <w:num w:numId="1" w16cid:durableId="231550109">
+    <w:abstractNumId w:val="0"/>
+  </w:num>
+</w:numbering>
 </file>
 
 <file path=word/styles.xml><?xml version="1.0" encoding="utf-8"?>
@@ -2267,6 +2693,29 @@
       <w:spacing w:val="5"/>
     </w:rPr>
   </w:style>
+  <w:style w:type="character" w:styleId="Hyperlink">
+    <w:name w:val="Hyperlink"/>
+    <w:basedOn w:val="DefaultParagraphFont"/>
+    <w:uiPriority w:val="99"/>
+    <w:unhideWhenUsed/>
+    <w:rsid w:val="00960757"/>
+    <w:rPr>
+      <w:color w:val="467886" w:themeColor="hyperlink"/>
+      <w:u w:val="single"/>
+    </w:rPr>
+  </w:style>
+  <w:style w:type="character" w:styleId="UnresolvedMention">
+    <w:name w:val="Unresolved Mention"/>
+    <w:basedOn w:val="DefaultParagraphFont"/>
+    <w:uiPriority w:val="99"/>
+    <w:semiHidden/>
+    <w:unhideWhenUsed/>
+    <w:rsid w:val="00960757"/>
+    <w:rPr>
+      <w:color w:val="605E5C"/>
+      <w:shd w:val="clear" w:color="auto" w:fill="E1DFDD"/>
+    </w:rPr>
+  </w:style>
 </w:styles>
 </file>
 

</xml_diff>